<commit_message>
Atualização de minuta de protocolo
</commit_message>
<xml_diff>
--- a/protocolos_minutas/AMA_Protocolo_CMD_Autenticação_Assinatura_Públicos_.docx
+++ b/protocolos_minutas/AMA_Protocolo_CMD_Autenticação_Assinatura_Públicos_.docx
@@ -653,15 +653,7 @@
       </w:r>
       <w:r>
         <w:tab/>
-        <w:t xml:space="preserve">Garantir a administração, operação, </w:t>
-      </w:r>
-      <w:proofErr w:type="spellStart"/>
-      <w:r>
-        <w:t>help-desk</w:t>
-      </w:r>
-      <w:proofErr w:type="spellEnd"/>
-      <w:r>
-        <w:t xml:space="preserve"> e manutenção do Fornecedor de Autenticação (Autenticação.Gov) e serviços de assinatura da Chave Móvel Digital;</w:t>
+        <w:t>Garantir a administração, operação, help-desk e manutenção do Fornecedor de Autenticação (Autenticação.Gov) e serviços de assinatura da Chave Móvel Digital;</w:t>
       </w:r>
     </w:p>
     <w:p>
@@ -1109,7 +1101,6 @@
         </w:rPr>
         <w:t xml:space="preserve">No âmbito da assinatura com Chave Móvel Digital, cumprir as </w:t>
       </w:r>
-      <w:proofErr w:type="spellStart"/>
       <w:r>
         <w:rPr>
           <w:rFonts w:cs="Times New Roman"/>
@@ -1117,7 +1108,6 @@
         </w:rPr>
         <w:t>guidelines</w:t>
       </w:r>
-      <w:proofErr w:type="spellEnd"/>
       <w:r>
         <w:rPr>
           <w:rFonts w:cs="Times New Roman"/>
@@ -1142,21 +1132,12 @@
         </w:rPr>
         <w:t xml:space="preserve">No âmbito da assinatura com Chave Móvel Digital, disponibilizar à AMA documento que demonstre, para cada uma das </w:t>
       </w:r>
-      <w:proofErr w:type="spellStart"/>
       <w:r>
         <w:rPr>
           <w:rFonts w:cs="Times New Roman"/>
           <w:i/>
         </w:rPr>
-        <w:t>guidelines</w:t>
-      </w:r>
-      <w:proofErr w:type="spellEnd"/>
-      <w:r>
-        <w:rPr>
-          <w:rFonts w:cs="Times New Roman"/>
-          <w:i/>
-        </w:rPr>
-        <w:t xml:space="preserve"> </w:t>
+        <w:t xml:space="preserve">guidelines </w:t>
       </w:r>
       <w:r>
         <w:rPr>
@@ -1252,7 +1233,6 @@
         <w:rPr>
           <w:b/>
         </w:rPr>
-        <w:lastRenderedPageBreak/>
         <w:t>Cláusula 4.ª</w:t>
       </w:r>
     </w:p>
@@ -1270,6 +1250,7 @@
         <w:rPr>
           <w:b/>
         </w:rPr>
+        <w:lastRenderedPageBreak/>
         <w:t>Custos de utilização do serviço</w:t>
       </w:r>
     </w:p>
@@ -1574,7 +1555,6 @@
         <w:jc w:val="both"/>
       </w:pPr>
       <w:r>
-        <w:lastRenderedPageBreak/>
         <w:t>Para os efeitos legais e os que decorrerem da execução do presente Protocolo, são identificados pelas Partes os respetivos encarregados de proteção de dados, responsáveis, nomeadamente:</w:t>
       </w:r>
     </w:p>
@@ -1591,6 +1571,7 @@
         <w:jc w:val="both"/>
       </w:pPr>
       <w:r>
+        <w:lastRenderedPageBreak/>
         <w:t xml:space="preserve">Pela AMA, </w:t>
       </w:r>
       <w:hyperlink r:id="rId14" w:history="1">
@@ -1828,7 +1809,6 @@
         <w:jc w:val="both"/>
       </w:pPr>
       <w:r>
-        <w:lastRenderedPageBreak/>
         <w:t>Qualquer alteração ou cláusula adicional ao presente Protocolo só será válida se constar de documento assinado pelas Partes Outorgantes.</w:t>
       </w:r>
     </w:p>
@@ -1856,6 +1836,7 @@
           <w:rFonts w:cs="Times New Roman"/>
           <w:b/>
         </w:rPr>
+        <w:lastRenderedPageBreak/>
         <w:t>Cláusula 9.ª</w:t>
       </w:r>
     </w:p>
@@ -3620,7 +3601,7 @@
         <w:lang w:val="en-GB" w:eastAsia="en-GB"/>
       </w:rPr>
       <w:drawing>
-        <wp:inline distT="0" distB="0" distL="0" distR="0" wp14:anchorId="3BBD8597" wp14:editId="6AAF426F">
+        <wp:inline distT="0" distB="0" distL="0" distR="0" wp14:anchorId="0D0EB3B7" wp14:editId="08112516">
           <wp:extent cx="2228850" cy="419100"/>
           <wp:effectExtent l="0" t="0" r="0" b="0"/>
           <wp:docPr id="1083400343" name="Imagem 1083400343" descr="A black background with a black square&#10;&#10;AI-generated content may be incorrect."/>
@@ -3699,15 +3680,6 @@
       </w:rPr>
       <w:t>Espaço para logotipo do parceiro]</w:t>
     </w:r>
-  </w:p>
-  <w:p>
-    <w:pPr>
-      <w:tabs>
-        <w:tab w:val="center" w:pos="4252"/>
-        <w:tab w:val="right" w:pos="8504"/>
-      </w:tabs>
-      <w:spacing w:after="0" w:line="240" w:lineRule="auto"/>
-    </w:pPr>
   </w:p>
   <w:p>
     <w:pPr>
@@ -5855,6 +5827,48 @@
 </file>
 
 <file path=customXml/item1.xml><?xml version="1.0" encoding="utf-8"?>
+<b:Sources xmlns:b="http://schemas.openxmlformats.org/officeDocument/2006/bibliography" xmlns="http://schemas.openxmlformats.org/officeDocument/2006/bibliography" SelectedStyle="\APA.XSL" StyleName="APA"/>
+</file>
+
+<file path=customXml/item2.xml><?xml version="1.0" encoding="utf-8"?>
+<p:properties xmlns:p="http://schemas.microsoft.com/office/2006/metadata/properties" xmlns:xsi="http://www.w3.org/2001/XMLSchema-instance" xmlns:pc="http://schemas.microsoft.com/office/infopath/2007/PartnerControls">
+  <documentManagement/>
+</p:properties>
+</file>
+
+<file path=customXml/item3.xml><?xml version="1.0" encoding="utf-8"?>
+<f:fields xmlns:f="http://schemas.fabasoft.com/folio/2007/fields">
+  <f:record>
+    <f:field ref="objname" par="" text="AMA_Protocolo_CMD_Autenticação_Assinatura_Públicos" edit="true"/>
+    <f:field ref="objsubject" par="" text="" edit="true"/>
+    <f:field ref="objcreatedby" par="" text="Joana Pires"/>
+    <f:field ref="objcreatedat" par="" date="2022-01-19T16:09:30" text="19/01/2022 16:09:30"/>
+    <f:field ref="objchangedby" par="" text="Joana Pires"/>
+    <f:field ref="objmodifiedat" par="" date="2022-01-19T16:09:30" text="19/01/2022 16:09:30"/>
+    <f:field ref="doc_FSCFOLIO_1_1001_FieldDocumentNumber" par="" text=""/>
+    <f:field ref="doc_FSCFOLIO_1_1001_FieldSubject" par="" text="" edit="true"/>
+    <f:field ref="FSCFOLIO_1_1001_FieldCurrentUser" par="" text="Joana Pires"/>
+    <f:field ref="CCAPRECONFIG_15_1001_Objektname" par="" text="AMA_Protocolo_CMD_Autenticação_Assinatura_Públicos" edit="true"/>
+    <f:field ref="CCAPRECONFIG_15_1001_Objektname" par="" text="AMA_Protocolo_CMD_Autenticação_Assinatura_Públicos" edit="true"/>
+  </f:record>
+  <f:display par="" text="General">
+    <f:field ref="objname" text="Nome"/>
+    <f:field ref="objsubject" text="Assunto"/>
+    <f:field ref="objcreatedby" text="Criado por"/>
+    <f:field ref="objcreatedat" text="Criado em/às"/>
+    <f:field ref="objchangedby" text="Última alteração por"/>
+    <f:field ref="objmodifiedat" text="Última alteração em/às"/>
+    <f:field ref="FSCFOLIO_1_1001_FieldCurrentUser" text="Utilizador actual"/>
+    <f:field ref="CCAPRECONFIG_15_1001_Objektname" text="Objektname"/>
+  </f:display>
+  <f:display par="" text="Carta em série">
+    <f:field ref="doc_FSCFOLIO_1_1001_FieldDocumentNumber" text="Número do documento"/>
+    <f:field ref="doc_FSCFOLIO_1_1001_FieldSubject" text="Assunto"/>
+  </f:display>
+</f:fields>
+</file>
+
+<file path=customXml/item4.xml><?xml version="1.0" encoding="utf-8"?>
 <?mso-contentType ?>
 <FormTemplates xmlns="http://schemas.microsoft.com/sharepoint/v3/contenttype/forms">
   <Display>DocumentLibraryForm</Display>
@@ -5863,7 +5877,7 @@
 </FormTemplates>
 </file>
 
-<file path=customXml/item2.xml><?xml version="1.0" encoding="utf-8"?>
+<file path=customXml/item5.xml><?xml version="1.0" encoding="utf-8"?>
 <ct:contentTypeSchema xmlns:ct="http://schemas.microsoft.com/office/2006/metadata/contentType" xmlns:ma="http://schemas.microsoft.com/office/2006/metadata/properties/metaAttributes" ct:_="" ma:_="" ma:contentTypeName="Documento" ma:contentTypeID="0x0101005B33CE0989C7C04FAC1059BFCF2AA9C9" ma:contentTypeVersion="12" ma:contentTypeDescription="Criar um novo documento." ma:contentTypeScope="" ma:versionID="64f3ecc5ecdce8036863e73af23c9e95">
   <xsd:schema xmlns:xsd="http://www.w3.org/2001/XMLSchema" xmlns:xs="http://www.w3.org/2001/XMLSchema" xmlns:p="http://schemas.microsoft.com/office/2006/metadata/properties" xmlns:ns2="29131337-9f48-4dd8-8094-a140ac1e3b23" xmlns:ns3="ee0d3de4-1e47-4168-94db-bd82c32bb80b" targetNamespace="http://schemas.microsoft.com/office/2006/metadata/properties" ma:root="true" ma:fieldsID="cd8d3b229c0ebe245858252c2b788675" ns2:_="" ns3:_="">
     <xsd:import namespace="29131337-9f48-4dd8-8094-a140ac1e3b23"/>
@@ -6080,49 +6094,32 @@
 </ct:contentTypeSchema>
 </file>
 
-<file path=customXml/item3.xml><?xml version="1.0" encoding="utf-8"?>
-<b:Sources xmlns:b="http://schemas.openxmlformats.org/officeDocument/2006/bibliography" xmlns="http://schemas.openxmlformats.org/officeDocument/2006/bibliography" SelectedStyle="\APA.XSL" StyleName="APA"/>
+<file path=customXml/itemProps1.xml><?xml version="1.0" encoding="utf-8"?>
+<ds:datastoreItem xmlns:ds="http://schemas.openxmlformats.org/officeDocument/2006/customXml" ds:itemID="{3DA58252-D024-492F-8749-F6DB2B5313D0}">
+  <ds:schemaRefs>
+    <ds:schemaRef ds:uri="http://schemas.openxmlformats.org/officeDocument/2006/bibliography"/>
+  </ds:schemaRefs>
+</ds:datastoreItem>
 </file>
 
-<file path=customXml/item4.xml><?xml version="1.0" encoding="utf-8"?>
-<p:properties xmlns:p="http://schemas.microsoft.com/office/2006/metadata/properties" xmlns:xsi="http://www.w3.org/2001/XMLSchema-instance" xmlns:pc="http://schemas.microsoft.com/office/infopath/2007/PartnerControls">
-  <documentManagement/>
-</p:properties>
+<file path=customXml/itemProps2.xml><?xml version="1.0" encoding="utf-8"?>
+<ds:datastoreItem xmlns:ds="http://schemas.openxmlformats.org/officeDocument/2006/customXml" ds:itemID="{DA7C3338-F97D-4A0C-8576-F94CEC57C390}">
+  <ds:schemaRefs>
+    <ds:schemaRef ds:uri="http://schemas.microsoft.com/office/2006/metadata/properties"/>
+    <ds:schemaRef ds:uri="http://schemas.microsoft.com/office/infopath/2007/PartnerControls"/>
+  </ds:schemaRefs>
+</ds:datastoreItem>
 </file>
 
-<file path=customXml/item5.xml><?xml version="1.0" encoding="utf-8"?>
-<f:fields xmlns:f="http://schemas.fabasoft.com/folio/2007/fields">
-  <f:record>
-    <f:field ref="objname" par="" text="AMA_Protocolo_CMD_Autenticação_Assinatura_Públicos" edit="true"/>
-    <f:field ref="objsubject" par="" text="" edit="true"/>
-    <f:field ref="objcreatedby" par="" text="Joana Pires"/>
-    <f:field ref="objcreatedat" par="" date="2022-01-19T16:09:30" text="19/01/2022 16:09:30"/>
-    <f:field ref="objchangedby" par="" text="Joana Pires"/>
-    <f:field ref="objmodifiedat" par="" date="2022-01-19T16:09:30" text="19/01/2022 16:09:30"/>
-    <f:field ref="doc_FSCFOLIO_1_1001_FieldDocumentNumber" par="" text=""/>
-    <f:field ref="doc_FSCFOLIO_1_1001_FieldSubject" par="" text="" edit="true"/>
-    <f:field ref="FSCFOLIO_1_1001_FieldCurrentUser" par="" text="Joana Pires"/>
-    <f:field ref="CCAPRECONFIG_15_1001_Objektname" par="" text="AMA_Protocolo_CMD_Autenticação_Assinatura_Públicos" edit="true"/>
-    <f:field ref="CCAPRECONFIG_15_1001_Objektname" par="" text="AMA_Protocolo_CMD_Autenticação_Assinatura_Públicos" edit="true"/>
-  </f:record>
-  <f:display par="" text="General">
-    <f:field ref="objname" text="Nome"/>
-    <f:field ref="objsubject" text="Assunto"/>
-    <f:field ref="objcreatedby" text="Criado por"/>
-    <f:field ref="objcreatedat" text="Criado em/às"/>
-    <f:field ref="objchangedby" text="Última alteração por"/>
-    <f:field ref="objmodifiedat" text="Última alteração em/às"/>
-    <f:field ref="FSCFOLIO_1_1001_FieldCurrentUser" text="Utilizador actual"/>
-    <f:field ref="CCAPRECONFIG_15_1001_Objektname" text="Objektname"/>
-  </f:display>
-  <f:display par="" text="Carta em série">
-    <f:field ref="doc_FSCFOLIO_1_1001_FieldDocumentNumber" text="Número do documento"/>
-    <f:field ref="doc_FSCFOLIO_1_1001_FieldSubject" text="Assunto"/>
-  </f:display>
-</f:fields>
+<file path=customXml/itemProps3.xml><?xml version="1.0" encoding="utf-8"?>
+<ds:datastoreItem xmlns:ds="http://schemas.openxmlformats.org/officeDocument/2006/customXml" ds:itemID="{4E8A9591-F074-446B-902F-511FF79C122F}">
+  <ds:schemaRefs>
+    <ds:schemaRef ds:uri="http://schemas.fabasoft.com/folio/2007/fields"/>
+  </ds:schemaRefs>
+</ds:datastoreItem>
 </file>
 
-<file path=customXml/itemProps1.xml><?xml version="1.0" encoding="utf-8"?>
+<file path=customXml/itemProps4.xml><?xml version="1.0" encoding="utf-8"?>
 <ds:datastoreItem xmlns:ds="http://schemas.openxmlformats.org/officeDocument/2006/customXml" ds:itemID="{8C593FB4-205D-483C-96BD-C932F7994346}">
   <ds:schemaRefs>
     <ds:schemaRef ds:uri="http://schemas.microsoft.com/sharepoint/v3/contenttype/forms"/>
@@ -6130,7 +6127,7 @@
 </ds:datastoreItem>
 </file>
 
-<file path=customXml/itemProps2.xml><?xml version="1.0" encoding="utf-8"?>
+<file path=customXml/itemProps5.xml><?xml version="1.0" encoding="utf-8"?>
 <ds:datastoreItem xmlns:ds="http://schemas.openxmlformats.org/officeDocument/2006/customXml" ds:itemID="{AC409F85-CD38-4785-8CBF-2AB2FEAA4388}">
   <ds:schemaRefs>
     <ds:schemaRef ds:uri="http://schemas.microsoft.com/office/2006/metadata/contentType"/>
@@ -6147,29 +6144,4 @@
     <ds:schemaRef ds:uri="http://schemas.microsoft.com/internal/obd"/>
   </ds:schemaRefs>
 </ds:datastoreItem>
-</file>
-
-<file path=customXml/itemProps3.xml><?xml version="1.0" encoding="utf-8"?>
-<ds:datastoreItem xmlns:ds="http://schemas.openxmlformats.org/officeDocument/2006/customXml" ds:itemID="{3DA58252-D024-492F-8749-F6DB2B5313D0}">
-  <ds:schemaRefs>
-    <ds:schemaRef ds:uri="http://schemas.openxmlformats.org/officeDocument/2006/bibliography"/>
-  </ds:schemaRefs>
-</ds:datastoreItem>
-</file>
-
-<file path=customXml/itemProps4.xml><?xml version="1.0" encoding="utf-8"?>
-<ds:datastoreItem xmlns:ds="http://schemas.openxmlformats.org/officeDocument/2006/customXml" ds:itemID="{DA7C3338-F97D-4A0C-8576-F94CEC57C390}">
-  <ds:schemaRefs>
-    <ds:schemaRef ds:uri="http://schemas.microsoft.com/office/2006/metadata/properties"/>
-    <ds:schemaRef ds:uri="http://schemas.microsoft.com/office/infopath/2007/PartnerControls"/>
-  </ds:schemaRefs>
-</ds:datastoreItem>
-</file>
-
-<file path=customXml/itemProps5.xml><?xml version="1.0" encoding="utf-8"?>
-<ds:datastoreItem xmlns:ds="http://schemas.openxmlformats.org/officeDocument/2006/customXml" ds:itemID="{4E8A9591-F074-446B-902F-511FF79C122F}">
-  <ds:schemaRefs>
-    <ds:schemaRef ds:uri="http://schemas.fabasoft.com/folio/2007/fields"/>
-  </ds:schemaRefs>
-</ds:datastoreItem>
 </file>
</xml_diff>